<commit_message>
Fix: Add Experience and Formacion fields to Contratista form and document generation
</commit_message>
<xml_diff>
--- a/plantillas/INVERSION_4_COMPLEMENTO_CONTRATO.docx
+++ b/plantillas/INVERSION_4_COMPLEMENTO_CONTRATO.docx
@@ -65,7 +65,7 @@
           <w:sz w:val="24"/>
           <w:szCs w:val="24"/>
         </w:rPr>
-        <w:t>CONTRATO No. {{NUMERO_PROCESO}}</w:t>
+        <w:t>CONTRATO No. {{NUMERO_CONTRATO}}</w:t>
       </w:r>
     </w:p>
     <w:p>
@@ -526,14 +526,26 @@
           <w:szCs w:val="24"/>
         </w:rPr>
       </w:pPr>
+    </w:p>
+    <w:p>
+      <w:pPr>
+        <w:tabs>
+          <w:tab w:val="left" w:pos="1239"/>
+        </w:tabs>
+        <w:jc w:val="both"/>
+        <w:rPr>
+          <w:rFonts w:ascii="Arial" w:eastAsia="Arial" w:hAnsi="Arial" w:cs="Arial"/>
+          <w:sz w:val="24"/>
+          <w:szCs w:val="24"/>
+        </w:rPr>
+      </w:pPr>
       <w:r>
         <w:rPr>
           <w:rFonts w:ascii="Arial" w:eastAsia="Arial" w:hAnsi="Arial" w:cs="Arial"/>
           <w:sz w:val="24"/>
           <w:szCs w:val="24"/>
         </w:rPr>
-        <w:lastRenderedPageBreak/>
-        <w:t xml:space="preserve">CLÁUSULA DÉCIMA. SANCIONES EN CASO DE INCUMPLIMIENTO: Las partes de mutuo acuerdo y, de conformidad con lo dispuesto en el Estatuto General de Contratación Pública, establecemos las siguientes sanciones contractuales: I. MULTAS: En virtud del deber de control y vigilancia sobre el contrato, el CONTRATANTE tendrá la facultad de imponer al CONTRATISTA las multas pactadas en el contrato con el fin de conminarlo al cumplimiento de sus obligaciones, en los términos que establece la normativa vigente aplicable. Para tales efectos, las partes acuerdan que en caso de incumplimiento de alguna de las obligaciones adquiridas por el CONTRATISTA o cumplidas deficientemente o por fuera del término estipulado para cada obligación, se causará una multa equivalente hasta el uno por mil (1/1000) del valor total del contrato por cada día calendario transcurrido a partir de la fecha prevista para el cumplimiento de dichas obligaciones. La imposición de la multa atenderá los criterios de razonabilidad, proporcionalidad y gravedad de la obligación incumplida. Si pasaren más de treinta (30) días calendario sin que el (la) CONTRATISTA haya cumplido la actividad obligacional en mora, el CONTRATANTE podrá declarar la caducidad del presente contrato ya que la mora por más de treinta (30) días se considera un incumplimiento grave. Contra dicha resolución procede el recurso de reposición de conformidad con la normativa vigente aplicable. II. CLAUSULA PENAL PECUNIARIA: En caso de declaratoria de incumplimiento el CONTRATISTA pagará al CONTRATANTE a título de Cláusula Penal Pecuniaria una suma equivalente al diez por ciento (10%) del valor total del Contrato de Prestación de Servicios. III. CADUCIDAD ADMINISTRATIVA: El CONTRATANTE podrá declarar la caducidad del contrato cuando se presenten hechos constitutivos de incumplimiento de las obligaciones a cargo del CONTRATISTA que afecten en forma grave y directa la ejecución del contrato y se evidencie que puede generar su paralización (normativa vigente aplicable), dará lugar a la declaratoria de caducidad del contrato el incumplimiento de la obligación de informar inmediatamente al CONTRATANTE , sobre la ocurrencia de peticiones o amenazas de quienes actúan por fuera de la Ley, con el objetivo de obligarlos a hacer u omitir algún acto o hecho y por las causales a que se refiere la  normativa vigente aplicable. Se entiende como incumplimiento grave la sistemática omisión en la respuesta o atención de las obligaciones a su cargo. En caso de producirse la declaratoria de caducidad, no habrá lugar a la indemnización para el CONTRATISTA quien se hará acreedor a las sanciones e inhabilidades establecidas en la normativa vigente aplicable.  La resolución de caducidad se notificará personalmente al CONTRATISTA o a su representante o apoderado conforme al Código de Procedimiento Administrativo y de lo Contencioso Administrativo (Ley 1437 de 2011). Contra la resolución de caducidad procede el recurso de reposición en los términos consagrados en la normativa vigente aplicable. PARÁGRAFO: Para la imposición de las sanciones contractuales descritas en esta </w:t>
+        <w:t xml:space="preserve">CLÁUSULA DÉCIMA. SANCIONES EN CASO DE INCUMPLIMIENTO: Las partes de mutuo acuerdo y, de conformidad con lo dispuesto en el Estatuto General de Contratación Pública, establecemos las siguientes sanciones contractuales: I. MULTAS: En virtud del deber de control y vigilancia sobre el contrato, el CONTRATANTE tendrá la facultad de imponer al CONTRATISTA las multas pactadas en el contrato con el fin de conminarlo al cumplimiento de sus obligaciones, en los términos que establece la normativa vigente aplicable. Para tales efectos, las partes acuerdan que en caso de incumplimiento de alguna de las obligaciones adquiridas por el CONTRATISTA o cumplidas deficientemente o por fuera del término estipulado para cada obligación, se causará una multa equivalente hasta el uno por mil (1/1000) del valor total del contrato por cada día calendario transcurrido a partir de la fecha prevista para el cumplimiento de dichas obligaciones. La imposición de la multa atenderá los criterios de razonabilidad, proporcionalidad y gravedad de la obligación incumplida. Si pasaren más de treinta (30) días calendario sin que el (la) CONTRATISTA haya cumplido la actividad obligacional en mora, el CONTRATANTE podrá declarar la caducidad del presente contrato ya que la mora por más de treinta (30) días se considera un incumplimiento grave. Contra dicha resolución procede el recurso de reposición de conformidad con la normativa vigente aplicable. II. CLAUSULA PENAL PECUNIARIA: En caso de declaratoria de incumplimiento el CONTRATISTA pagará al CONTRATANTE a título de Cláusula Penal Pecuniaria una suma equivalente al diez por ciento (10%) del valor total del Contrato de Prestación de Servicios. III. CADUCIDAD ADMINISTRATIVA: El CONTRATANTE podrá declarar la caducidad del contrato cuando se presenten hechos constitutivos de incumplimiento de las obligaciones a cargo del CONTRATISTA que afecten en forma grave y directa la ejecución del contrato y se evidencie que puede generar su paralización (normativa vigente aplicable), dará lugar a la declaratoria de caducidad del contrato el incumplimiento de la obligación de informar inmediatamente al CONTRATANTE , sobre la ocurrencia de peticiones o amenazas de quienes actúan por fuera de la Ley, con el objetivo de obligarlos a hacer u omitir algún acto o hecho y por las causales a que se refiere la  normativa vigente aplicable. Se entiende como incumplimiento grave la sistemática omisión en la respuesta o atención de las obligaciones a su cargo. En caso de producirse la declaratoria de caducidad, no habrá lugar a la indemnización para el CONTRATISTA quien se hará acreedor a las sanciones e inhabilidades establecidas en la normativa vigente aplicable.  La resolución de caducidad se notificará personalmente al CONTRATISTA o a su representante o apoderado conforme al Código de Procedimiento Administrativo y de lo Contencioso Administrativo (Ley 1437 de 2011). Contra la resolución de caducidad procede el recurso de reposición en los términos consagrados en la normativa vigente aplicable. </w:t>
       </w:r>
       <w:r>
         <w:rPr>
@@ -542,7 +554,7 @@
           <w:szCs w:val="24"/>
         </w:rPr>
         <w:lastRenderedPageBreak/>
-        <w:t>cláusula se deberá seguir el procedimiento mínimo que garantice el debido proceso acorde a la normativa vigente aplicable.</w:t>
+        <w:t>PARÁGRAFO: Para la imposición de las sanciones contractuales descritas en esta cláusula se deberá seguir el procedimiento mínimo que garantice el debido proceso acorde a la normativa vigente aplicable.</w:t>
       </w:r>
     </w:p>
     <w:p>
@@ -729,8 +741,30 @@
           <w:sz w:val="24"/>
           <w:szCs w:val="24"/>
         </w:rPr>
-        <w:t>En caso de optar por no conceder el plazo indicado en el literal anterior, o de otorgarlo y a su vencimiento el CONTRATISTA no subsane la situación que dé lugar a la terminación anticipada, el CONTRATISTA deberá presentar las justificaciones o pruebas que considere pertinentes para desvirtuar la causal de terminación invocada por EL CONTRATANTE, para ello, EL CONTRATANTE definirá el plazo para el pronunciamiento del CONTRATISTA, sin que pueda exceder de cinco (5) días hábiles.</w:t>
+        <w:t xml:space="preserve">En caso de optar por no conceder el plazo indicado en el literal anterior, o de otorgarlo y a su vencimiento el CONTRATISTA no subsane la situación que dé lugar a la terminación anticipada, el CONTRATISTA deberá presentar las justificaciones o pruebas que considere pertinentes para desvirtuar la causal de terminación invocada por EL CONTRATANTE, para ello, EL CONTRATANTE definirá el plazo para el </w:t>
       </w:r>
+      <w:r>
+        <w:rPr>
+          <w:rFonts w:ascii="Arial" w:eastAsia="Arial" w:hAnsi="Arial" w:cs="Arial"/>
+          <w:sz w:val="24"/>
+          <w:szCs w:val="24"/>
+        </w:rPr>
+        <w:lastRenderedPageBreak/>
+        <w:t>pronunciamiento del CONTRATISTA, sin que pueda exceder de cinco (5) días hábiles.</w:t>
+      </w:r>
+    </w:p>
+    <w:p>
+      <w:pPr>
+        <w:tabs>
+          <w:tab w:val="left" w:pos="1239"/>
+        </w:tabs>
+        <w:jc w:val="both"/>
+        <w:rPr>
+          <w:rFonts w:ascii="Arial" w:eastAsia="Arial" w:hAnsi="Arial" w:cs="Arial"/>
+          <w:sz w:val="24"/>
+          <w:szCs w:val="24"/>
+        </w:rPr>
+      </w:pPr>
     </w:p>
     <w:p>
       <w:pPr>
@@ -749,15 +783,12 @@
           <w:szCs w:val="24"/>
         </w:rPr>
       </w:pPr>
-      <w:bookmarkStart w:id="1" w:name="_GoBack"/>
-      <w:bookmarkEnd w:id="1"/>
       <w:r>
         <w:rPr>
           <w:rFonts w:ascii="Arial" w:eastAsia="Arial" w:hAnsi="Arial" w:cs="Arial"/>
           <w:sz w:val="24"/>
           <w:szCs w:val="24"/>
         </w:rPr>
-        <w:lastRenderedPageBreak/>
         <w:t>Dentro de los cinco (5) días hábiles siguientes al recibo de la respuesta emitida por EL CONTRATISTA, EL CONTRATANTE dará respuesta en uno de los siguientes sentidos:</w:t>
       </w:r>
     </w:p>
@@ -932,7 +963,16 @@
           <w:sz w:val="24"/>
           <w:szCs w:val="24"/>
         </w:rPr>
-        <w:t xml:space="preserve">CLÁUSULA DÉCIMA SEGUNDA. SUSPENSIÓN DEL CONTRATO: El plazo para la ejecución del contrato podrá suspenderse por acuerdo entre las partes o cuando ocurran hechos o circunstancias constitutivas de una situación de fuerza mayor o caso fortuito que impidan el cumplimiento de las obligaciones asumidas. Si la suspensión es de mutuo acuerdo, deberá suscribirse un acta por las partes en la que conste la razón por la cual suspenden la ejecución del contrato, la forma como se asumirán los costos que se generen con ocasión de la misma, las actividades que se desarrollarán tendientes a superar el motivo de suspensión. Mientras subsistan hechos constitutivos de una situación de fuerza mayor o caso fortuito, y estas impidan la ejecución total del contrato, el plazo para la ejecución del contrato se suspenderá de la siguiente manera: (i) por el término que dure la situación que configura la circunstancia de caso fortuito o fuerza mayor. (ii) Si los hechos constitutivos de una situación de fuerza mayor y caso fortuito no impiden la ejecución de la totalidad del contrato, sino sólo de manera parcial o de alguna o algunas de las obligaciones de este contrato, las partes convendrán si tales circunstancias suponen o no la suspensión de la totalidad del contrato, y en su caso, el tiempo y los términos de suspensión. La suspensión de la ejecución del contrato por fuerza mayor o caso fortuito se hará constar en actas suscritas por las partes, en las cuales se indiquen los hechos que la motivan. Una vez cesen las causas de la suspensión se dejará constancia de este hecho y de la reiniciación de los plazos contractuales a que haya lugar; en actas suscritas por las partes. De generarse costos al CONTRATISTA producto de la suspensión, el CONTRATANTE deberá reconocerlos a efecto de llevar al CONTRATISTA a punto de no pérdida, siempre y cuando esté plenamente demostrado. </w:t>
+        <w:t xml:space="preserve">CLÁUSULA DÉCIMA SEGUNDA. SUSPENSIÓN DEL CONTRATO: El plazo para la ejecución del contrato podrá suspenderse por acuerdo entre las partes o cuando ocurran hechos o circunstancias constitutivas de una situación de fuerza mayor o caso fortuito que impidan el cumplimiento de las obligaciones asumidas. Si la suspensión es de mutuo acuerdo, deberá suscribirse un acta por las partes en la que conste la razón por la cual suspenden la ejecución del contrato, la forma como se asumirán los costos que se generen con ocasión de la misma, las actividades que se desarrollarán tendientes a superar el motivo de suspensión. Mientras subsistan hechos constitutivos de una situación de fuerza mayor o caso fortuito, y estas impidan la ejecución total del contrato, el plazo para la ejecución del contrato se suspenderá de la siguiente manera: (i) por el término que dure la situación que configura la circunstancia de caso fortuito o fuerza mayor. (ii) Si los hechos constitutivos de una situación de fuerza mayor y caso fortuito no impiden la ejecución de la totalidad del contrato, sino sólo de manera parcial o de alguna o algunas de las obligaciones de este contrato, las partes convendrán si tales circunstancias suponen o no la suspensión de la totalidad del contrato, y en su caso, el tiempo y los términos de suspensión. La suspensión de la ejecución del contrato por fuerza mayor o caso fortuito se hará constar en actas suscritas por las partes, en las cuales se indiquen los hechos que la motivan. Una vez cesen las causas de la suspensión se dejará constancia de este hecho y de la reiniciación de los plazos contractuales a que haya lugar; en actas suscritas por las partes. De generarse costos al CONTRATISTA producto de la suspensión, el CONTRATANTE deberá reconocerlos </w:t>
+      </w:r>
+      <w:r>
+        <w:rPr>
+          <w:rFonts w:ascii="Arial" w:eastAsia="Arial" w:hAnsi="Arial" w:cs="Arial"/>
+          <w:sz w:val="24"/>
+          <w:szCs w:val="24"/>
+        </w:rPr>
+        <w:lastRenderedPageBreak/>
+        <w:t xml:space="preserve">a efecto de llevar al CONTRATISTA a punto de no pérdida, siempre y cuando esté plenamente demostrado. </w:t>
       </w:r>
     </w:p>
     <w:p>
@@ -966,7 +1006,6 @@
           <w:sz w:val="24"/>
           <w:szCs w:val="24"/>
         </w:rPr>
-        <w:lastRenderedPageBreak/>
         <w:t>CLÁUSULA DÉCIMA TERCERA. CESIÓN: El (la) CONTRATISTA no podrá ceder parcial ni totalmente sus obligaciones o derechos derivados del presente contrato de prestación de servicios sin la autorización previa y escrita del CONTRATANTE. La cesión se hará de conformidad con lo previsto en la normativa vigente aplicable. En todo caso, el CONTRATANTE verificará que la idoneidad y experiencia del (la) cesionario (a) sea igual o superior a la solicitada en los estudios previos que dieron origen al contrato.</w:t>
       </w:r>
     </w:p>
@@ -1057,8 +1096,8 @@
           <w:szCs w:val="24"/>
         </w:rPr>
       </w:pPr>
-      <w:bookmarkStart w:id="2" w:name="_heading=h.d02i88nja45l" w:colFirst="0" w:colLast="0"/>
-      <w:bookmarkEnd w:id="2"/>
+      <w:bookmarkStart w:id="1" w:name="_heading=h.d02i88nja45l" w:colFirst="0" w:colLast="0"/>
+      <w:bookmarkEnd w:id="1"/>
       <w:r>
         <w:rPr>
           <w:rFonts w:ascii="Arial" w:eastAsia="Arial" w:hAnsi="Arial" w:cs="Arial"/>
@@ -1099,7 +1138,7 @@
           <w:sz w:val="24"/>
           <w:szCs w:val="24"/>
         </w:rPr>
-        <w:t xml:space="preserve">CLÁUSULA DÉCIMA SÉPTIMA. MARCO REGULATORIO DEL CONTRATO ELECTRÓNICO. En desarrollo con el artículo 3 de la ley 1150 de 2007, la Ley 1712 de 2014, el Decreto 4170 de 2011, el Decreto 1082 de 2015 y el Decreto 1083 de 2015, Colombia Compra Eficiente administra el SECOP II, plataforma transaccional que permite a Compradores y Proveedores realizar el Proceso de Contratación en línea. Por ello, y de conformidad con lo dispuesto en la Ley 527 de 1999, la sustanciación de las </w:t>
+        <w:t xml:space="preserve">CLÁUSULA DÉCIMA SÉPTIMA. MARCO REGULATORIO DEL CONTRATO ELECTRÓNICO. En desarrollo con el artículo 3 de la ley 1150 de 2007, la Ley 1712 de 2014, el Decreto 4170 de 2011, el Decreto 1082 de 2015 y el Decreto 1083 de 2015, </w:t>
       </w:r>
       <w:r>
         <w:rPr>
@@ -1108,7 +1147,7 @@
           <w:szCs w:val="24"/>
         </w:rPr>
         <w:lastRenderedPageBreak/>
-        <w:t>actuaciones, la expedición de los actos administrativos, los documentos, contratos y en general los actos derivados de las etapas de la Gestión contractual, tendrán lugar a través de la plataforma del SECOP II. Todos los documentos del proceso publicados en la plataforma del SECOP II son integrales y complementarios entre sí.</w:t>
+        <w:t>Colombia Compra Eficiente administra el SECOP II, plataforma transaccional que permite a Compradores y Proveedores realizar el Proceso de Contratación en línea. Por ello, y de conformidad con lo dispuesto en la Ley 527 de 1999, la sustanciación de las actuaciones, la expedición de los actos administrativos, los documentos, contratos y en general los actos derivados de las etapas de la Gestión contractual, tendrán lugar a través de la plataforma del SECOP II. Todos los documentos del proceso publicados en la plataforma del SECOP II son integrales y complementarios entre sí.</w:t>
       </w:r>
     </w:p>
     <w:p>
@@ -1319,12 +1358,43 @@
           <w:sz w:val="24"/>
           <w:szCs w:val="24"/>
         </w:rPr>
-        <w:t>{{NOMBRE_ORDENADOR_GASTO}}   {{CONTRATISTA_NOMBRE}}</w:t>
+        <w:t xml:space="preserve">{{NOMBRE_ORDENADOR_GASTO}}   </w:t>
       </w:r>
-    </w:p>
-    <w:p>
-      <w:pPr>
-        <w:ind w:left="4320" w:firstLine="720"/>
+      <w:r>
+        <w:rPr>
+          <w:rFonts w:ascii="Arial" w:eastAsia="Arial" w:hAnsi="Arial" w:cs="Arial"/>
+          <w:sz w:val="24"/>
+          <w:szCs w:val="24"/>
+        </w:rPr>
+        <w:tab/>
+      </w:r>
+      <w:r>
+        <w:rPr>
+          <w:rFonts w:ascii="Arial" w:eastAsia="Arial" w:hAnsi="Arial" w:cs="Arial"/>
+          <w:sz w:val="24"/>
+          <w:szCs w:val="24"/>
+        </w:rPr>
+        <w:tab/>
+      </w:r>
+      <w:r>
+        <w:rPr>
+          <w:rFonts w:ascii="Arial" w:eastAsia="Arial" w:hAnsi="Arial" w:cs="Arial"/>
+          <w:sz w:val="24"/>
+          <w:szCs w:val="24"/>
+        </w:rPr>
+        <w:t xml:space="preserve"> </w:t>
+      </w:r>
+      <w:r>
+        <w:rPr>
+          <w:rFonts w:ascii="Arial" w:eastAsia="Arial" w:hAnsi="Arial" w:cs="Arial"/>
+          <w:sz w:val="24"/>
+          <w:szCs w:val="24"/>
+        </w:rPr>
+        <w:t>{{CONTRATISTA_NOMBRE}}</w:t>
+      </w:r>
+    </w:p>
+    <w:p>
+      <w:pPr>
         <w:jc w:val="both"/>
         <w:rPr>
           <w:rFonts w:ascii="Arial" w:eastAsia="Arial" w:hAnsi="Arial" w:cs="Arial"/>
@@ -1332,6 +1402,32 @@
           <w:szCs w:val="24"/>
         </w:rPr>
       </w:pPr>
+      <w:r>
+        <w:rPr>
+          <w:rFonts w:ascii="Arial" w:eastAsia="Arial" w:hAnsi="Arial" w:cs="Arial"/>
+          <w:sz w:val="24"/>
+          <w:szCs w:val="24"/>
+        </w:rPr>
+        <w:t xml:space="preserve">Director de Departamento Administrativo </w:t>
+      </w:r>
+      <w:r>
+        <w:rPr>
+          <w:rFonts w:ascii="Arial" w:eastAsia="Arial" w:hAnsi="Arial" w:cs="Arial"/>
+          <w:sz w:val="24"/>
+          <w:szCs w:val="24"/>
+        </w:rPr>
+        <w:tab/>
+      </w:r>
+      <w:r>
+        <w:rPr>
+          <w:rFonts w:ascii="Arial" w:eastAsia="Arial" w:hAnsi="Arial" w:cs="Arial"/>
+          <w:sz w:val="24"/>
+          <w:szCs w:val="24"/>
+        </w:rPr>
+        <w:t xml:space="preserve"> </w:t>
+      </w:r>
+      <w:bookmarkStart w:id="2" w:name="_GoBack"/>
+      <w:bookmarkEnd w:id="2"/>
       <w:proofErr w:type="spellStart"/>
       <w:r>
         <w:rPr>
@@ -1367,23 +1463,6 @@
           <w:szCs w:val="24"/>
         </w:rPr>
         <w:t>{CONTRATISTA_CEDULA}}</w:t>
-      </w:r>
-    </w:p>
-    <w:p>
-      <w:pPr>
-        <w:rPr>
-          <w:rFonts w:ascii="Arial" w:eastAsia="Arial" w:hAnsi="Arial" w:cs="Arial"/>
-          <w:sz w:val="24"/>
-          <w:szCs w:val="24"/>
-        </w:rPr>
-      </w:pPr>
-      <w:r>
-        <w:rPr>
-          <w:rFonts w:ascii="Arial" w:eastAsia="Arial" w:hAnsi="Arial" w:cs="Arial"/>
-          <w:sz w:val="24"/>
-          <w:szCs w:val="24"/>
-        </w:rPr>
-        <w:t xml:space="preserve">Director de Departamento Administrativo </w:t>
       </w:r>
     </w:p>
     <w:p>
@@ -1721,7 +1800,7 @@
                 <w:sz w:val="16"/>
                 <w:szCs w:val="16"/>
               </w:rPr>
-              <w:t>9</w:t>
+              <w:t>10</w:t>
             </w:r>
             <w:r>
               <w:rPr>
@@ -1898,7 +1977,7 @@
         <w:sz w:val="16"/>
         <w:szCs w:val="16"/>
       </w:rPr>
-      <w:t>2</w:t>
+      <w:t>1</w:t>
     </w:r>
     <w:r>
       <w:rPr>
@@ -4624,6 +4703,15 @@
   <wne:recipientData>
     <wne:active wne:val="1"/>
   </wne:recipientData>
+  <wne:recipientData>
+    <wne:active wne:val="1"/>
+  </wne:recipientData>
+  <wne:recipientData>
+    <wne:active wne:val="1"/>
+  </wne:recipientData>
+  <wne:recipientData>
+    <wne:active wne:val="1"/>
+  </wne:recipientData>
 </wne:recipients>
 </file>
 
@@ -7656,7 +7744,7 @@
   <a:extraClrSchemeLst/>
   <a:extLst>
     <a:ext uri="{05A4C25C-085E-4340-85A3-A5531E510DB2}">
-      <thm15:themeFamily xmlns="" xmlns:thm15="http://schemas.microsoft.com/office/thememl/2012/main" name="Office Theme" id="{62F939B6-93AF-4DB8-9C6B-D6C7DFDC589F}" vid="{4A3C46E8-61CC-4603-A589-7422A47A8E4A}"/>
+      <thm15:themeFamily xmlns:thm15="http://schemas.microsoft.com/office/thememl/2012/main" xmlns="" name="Office Theme" id="{62F939B6-93AF-4DB8-9C6B-D6C7DFDC589F}" vid="{4A3C46E8-61CC-4603-A589-7422A47A8E4A}"/>
     </a:ext>
   </a:extLst>
 </a:theme>
@@ -7682,7 +7770,7 @@
 </file>
 
 <file path=customXml/itemProps2.xml><?xml version="1.0" encoding="utf-8"?>
-<ds:datastoreItem xmlns:ds="http://schemas.openxmlformats.org/officeDocument/2006/customXml" ds:itemID="{B47462BB-B892-40D8-8DC5-365A93850755}">
+<ds:datastoreItem xmlns:ds="http://schemas.openxmlformats.org/officeDocument/2006/customXml" ds:itemID="{A115A647-C91C-4596-9796-F06982BBC303}">
   <ds:schemaRefs>
     <ds:schemaRef ds:uri="http://schemas.openxmlformats.org/officeDocument/2006/bibliography"/>
   </ds:schemaRefs>

</xml_diff>

<commit_message>
Fix mapping issues and add missing fields
</commit_message>
<xml_diff>
--- a/plantillas/INVERSION_4_COMPLEMENTO_CONTRATO.docx
+++ b/plantillas/INVERSION_4_COMPLEMENTO_CONTRATO.docx
@@ -1320,70 +1320,142 @@
           <w:sz w:val="24"/>
           <w:szCs w:val="24"/>
         </w:rPr>
-        <w:t>EL CONTRATANTE                                            EL CONTRATISTA</w:t>
-      </w:r>
-    </w:p>
-    <w:p>
-      <w:pPr>
-        <w:jc w:val="both"/>
-        <w:rPr>
-          <w:rFonts w:ascii="Arial" w:eastAsia="Arial" w:hAnsi="Arial" w:cs="Arial"/>
-          <w:sz w:val="24"/>
-          <w:szCs w:val="24"/>
-        </w:rPr>
-      </w:pPr>
-    </w:p>
-    <w:p>
-      <w:pPr>
-        <w:jc w:val="both"/>
-        <w:rPr>
-          <w:rFonts w:ascii="Arial" w:eastAsia="Arial" w:hAnsi="Arial" w:cs="Arial"/>
-          <w:sz w:val="24"/>
-          <w:szCs w:val="24"/>
-        </w:rPr>
-      </w:pPr>
-    </w:p>
-    <w:p>
-      <w:pPr>
-        <w:jc w:val="both"/>
-        <w:rPr>
-          <w:rFonts w:ascii="Arial" w:eastAsia="Arial" w:hAnsi="Arial" w:cs="Arial"/>
-          <w:sz w:val="24"/>
-          <w:szCs w:val="24"/>
-        </w:rPr>
-      </w:pPr>
-      <w:r>
-        <w:rPr>
-          <w:rFonts w:ascii="Arial" w:eastAsia="Arial" w:hAnsi="Arial" w:cs="Arial"/>
-          <w:sz w:val="24"/>
-          <w:szCs w:val="24"/>
-        </w:rPr>
-        <w:t xml:space="preserve">{{NOMBRE_ORDENADOR_GASTO}}    {{CONTRATISTA_NOMBRE}}</w:t>
-      </w:r>
-    </w:p>
-    <w:p>
-      <w:pPr>
-        <w:jc w:val="both"/>
-        <w:rPr>
-          <w:rFonts w:ascii="Arial" w:eastAsia="Arial" w:hAnsi="Arial" w:cs="Arial"/>
-          <w:sz w:val="24"/>
-          <w:szCs w:val="24"/>
-        </w:rPr>
-      </w:pPr>
-      <w:r>
-        <w:rPr>
-          <w:rFonts w:ascii="Arial" w:eastAsia="Arial" w:hAnsi="Arial" w:cs="Arial"/>
-          <w:sz w:val="24"/>
-          <w:szCs w:val="24"/>
-        </w:rPr>
-        <w:t xml:space="preserve">Director de Departamento Administrativo  C.C.N°{{CONTRATISTA_CEDULA}}</w:t>
+        <w:t xml:space="preserve">EL CONTRATANTE                                           </w:t>
       </w:r>
       <w:bookmarkStart w:id="2" w:name="_GoBack"/>
       <w:bookmarkEnd w:id="2"/>
+      <w:r>
+        <w:rPr>
+          <w:rFonts w:ascii="Arial" w:eastAsia="Arial" w:hAnsi="Arial" w:cs="Arial"/>
+          <w:sz w:val="24"/>
+          <w:szCs w:val="24"/>
+        </w:rPr>
+        <w:t>EL CONTRATISTA</w:t>
+      </w:r>
+    </w:p>
+    <w:p>
+      <w:pPr>
+        <w:jc w:val="both"/>
+        <w:rPr>
+          <w:rFonts w:ascii="Arial" w:eastAsia="Arial" w:hAnsi="Arial" w:cs="Arial"/>
+          <w:sz w:val="24"/>
+          <w:szCs w:val="24"/>
+        </w:rPr>
+      </w:pPr>
+    </w:p>
+    <w:p>
+      <w:pPr>
+        <w:jc w:val="both"/>
+        <w:rPr>
+          <w:rFonts w:ascii="Arial" w:eastAsia="Arial" w:hAnsi="Arial" w:cs="Arial"/>
+          <w:sz w:val="24"/>
+          <w:szCs w:val="24"/>
+        </w:rPr>
+      </w:pPr>
+    </w:p>
+    <w:p>
+      <w:pPr>
+        <w:jc w:val="both"/>
+        <w:rPr>
+          <w:rFonts w:ascii="Arial" w:eastAsia="Arial" w:hAnsi="Arial" w:cs="Arial"/>
+          <w:sz w:val="24"/>
+          <w:szCs w:val="24"/>
+        </w:rPr>
+      </w:pPr>
+      <w:r>
+        <w:rPr>
+          <w:rFonts w:ascii="Arial" w:eastAsia="Arial" w:hAnsi="Arial" w:cs="Arial"/>
+          <w:sz w:val="24"/>
+          <w:szCs w:val="24"/>
+        </w:rPr>
+        <w:t xml:space="preserve">{{NOMBRE_ORDENADOR_GASTO}}    </w:t>
+      </w:r>
+      <w:r>
+        <w:rPr>
+          <w:rFonts w:ascii="Arial" w:eastAsia="Arial" w:hAnsi="Arial" w:cs="Arial"/>
+          <w:sz w:val="24"/>
+          <w:szCs w:val="24"/>
+        </w:rPr>
+        <w:tab/>
+      </w:r>
+      <w:r>
+        <w:rPr>
+          <w:rFonts w:ascii="Arial" w:eastAsia="Arial" w:hAnsi="Arial" w:cs="Arial"/>
+          <w:sz w:val="24"/>
+          <w:szCs w:val="24"/>
+        </w:rPr>
+        <w:tab/>
+      </w:r>
+      <w:r>
+        <w:rPr>
+          <w:rFonts w:ascii="Arial" w:eastAsia="Arial" w:hAnsi="Arial" w:cs="Arial"/>
+          <w:sz w:val="24"/>
+          <w:szCs w:val="24"/>
+        </w:rPr>
+        <w:t>{{CONTRATISTA_NOMBRE}}</w:t>
+      </w:r>
+    </w:p>
+    <w:p>
+      <w:pPr>
+        <w:jc w:val="both"/>
+        <w:rPr>
+          <w:rFonts w:ascii="Arial" w:eastAsia="Arial" w:hAnsi="Arial" w:cs="Arial"/>
+          <w:sz w:val="24"/>
+          <w:szCs w:val="24"/>
+        </w:rPr>
+      </w:pPr>
+      <w:r>
+        <w:rPr>
+          <w:rFonts w:ascii="Arial" w:eastAsia="Arial" w:hAnsi="Arial" w:cs="Arial"/>
+          <w:sz w:val="24"/>
+          <w:szCs w:val="24"/>
+        </w:rPr>
+        <w:t xml:space="preserve">Director de Departamento Administrativo  </w:t>
+      </w:r>
+      <w:r>
+        <w:rPr>
+          <w:rFonts w:ascii="Arial" w:eastAsia="Arial" w:hAnsi="Arial" w:cs="Arial"/>
+          <w:sz w:val="24"/>
+          <w:szCs w:val="24"/>
+        </w:rPr>
+        <w:tab/>
+      </w:r>
       <w:proofErr w:type="spellStart"/>
+      <w:r>
+        <w:rPr>
+          <w:rFonts w:ascii="Arial" w:eastAsia="Arial" w:hAnsi="Arial" w:cs="Arial"/>
+          <w:sz w:val="24"/>
+          <w:szCs w:val="24"/>
+        </w:rPr>
+        <w:t>C.C.N</w:t>
+      </w:r>
       <w:proofErr w:type="gramStart"/>
+      <w:r>
+        <w:rPr>
+          <w:rFonts w:ascii="Arial" w:eastAsia="Arial" w:hAnsi="Arial" w:cs="Arial"/>
+          <w:sz w:val="24"/>
+          <w:szCs w:val="24"/>
+        </w:rPr>
+        <w:t>°</w:t>
+      </w:r>
       <w:proofErr w:type="spellEnd"/>
+      <w:r>
+        <w:rPr>
+          <w:rFonts w:ascii="Arial" w:eastAsia="Arial" w:hAnsi="Arial" w:cs="Arial"/>
+          <w:sz w:val="24"/>
+          <w:szCs w:val="24"/>
+        </w:rPr>
+        <w:t>{</w:t>
+      </w:r>
       <w:proofErr w:type="gramEnd"/>
+      <w:r>
+        <w:rPr>
+          <w:rFonts w:ascii="Arial" w:eastAsia="Arial" w:hAnsi="Arial" w:cs="Arial"/>
+          <w:sz w:val="24"/>
+          <w:szCs w:val="24"/>
+        </w:rPr>
+        <w:t>{CONTRATISTA_CEDULA}}</w:t>
+      </w:r>
     </w:p>
     <w:p>
       <w:pPr>
@@ -4632,6 +4704,9 @@
   <wne:recipientData>
     <wne:active wne:val="1"/>
   </wne:recipientData>
+  <wne:recipientData>
+    <wne:active wne:val="1"/>
+  </wne:recipientData>
 </wne:recipients>
 </file>
 
@@ -7664,7 +7739,7 @@
   <a:extraClrSchemeLst/>
   <a:extLst>
     <a:ext uri="{05A4C25C-085E-4340-85A3-A5531E510DB2}">
-      <thm15:themeFamily xmlns:thm15="http://schemas.microsoft.com/office/thememl/2012/main" xmlns="" name="Office Theme" id="{62F939B6-93AF-4DB8-9C6B-D6C7DFDC589F}" vid="{4A3C46E8-61CC-4603-A589-7422A47A8E4A}"/>
+      <thm15:themeFamily xmlns="" xmlns:thm15="http://schemas.microsoft.com/office/thememl/2012/main" name="Office Theme" id="{62F939B6-93AF-4DB8-9C6B-D6C7DFDC589F}" vid="{4A3C46E8-61CC-4603-A589-7422A47A8E4A}"/>
     </a:ext>
   </a:extLst>
 </a:theme>
@@ -7690,7 +7765,7 @@
 </file>
 
 <file path=customXml/itemProps2.xml><?xml version="1.0" encoding="utf-8"?>
-<ds:datastoreItem xmlns:ds="http://schemas.openxmlformats.org/officeDocument/2006/customXml" ds:itemID="{A115A647-C91C-4596-9796-F06982BBC303}">
+<ds:datastoreItem xmlns:ds="http://schemas.openxmlformats.org/officeDocument/2006/customXml" ds:itemID="{70C7F43D-0E5C-439B-B663-004C398A3416}">
   <ds:schemaRefs>
     <ds:schemaRef ds:uri="http://schemas.openxmlformats.org/officeDocument/2006/bibliography"/>
   </ds:schemaRefs>

</xml_diff>

<commit_message>
Actualizar plantillas de inversión 4 y 5
</commit_message>
<xml_diff>
--- a/plantillas/INVERSION_4_COMPLEMENTO_CONTRATO.docx
+++ b/plantillas/INVERSION_4_COMPLEMENTO_CONTRATO.docx
@@ -26,6 +26,14 @@
           <w:szCs w:val="24"/>
         </w:rPr>
         <w:t>${TIPO_CONTRATO</w:t>
+      </w:r>
+      <w:r>
+        <w:rPr>
+          <w:rFonts w:ascii="Arial" w:eastAsia="Arial" w:hAnsi="Arial" w:cs="Arial"/>
+          <w:sz w:val="24"/>
+          <w:szCs w:val="24"/>
+        </w:rPr>
+        <w:t>}</w:t>
       </w:r>
       <w:bookmarkStart w:id="0" w:name="_GoBack"/>
       <w:bookmarkEnd w:id="0"/>
@@ -1759,7 +1767,7 @@
                 <w:sz w:val="16"/>
                 <w:szCs w:val="16"/>
               </w:rPr>
-              <w:t>9</w:t>
+              <w:t>1</w:t>
             </w:r>
             <w:r>
               <w:rPr>
@@ -4738,6 +4746,9 @@
   <wne:recipientData>
     <wne:active wne:val="1"/>
   </wne:recipientData>
+  <wne:recipientData>
+    <wne:active wne:val="1"/>
+  </wne:recipientData>
 </wne:recipients>
 </file>
 
@@ -7770,7 +7781,7 @@
   <a:extraClrSchemeLst/>
   <a:extLst>
     <a:ext uri="{05A4C25C-085E-4340-85A3-A5531E510DB2}">
-      <thm15:themeFamily xmlns:thm15="http://schemas.microsoft.com/office/thememl/2012/main" xmlns="" name="Office Theme" id="{62F939B6-93AF-4DB8-9C6B-D6C7DFDC589F}" vid="{4A3C46E8-61CC-4603-A589-7422A47A8E4A}"/>
+      <thm15:themeFamily xmlns="" xmlns:thm15="http://schemas.microsoft.com/office/thememl/2012/main" name="Office Theme" id="{62F939B6-93AF-4DB8-9C6B-D6C7DFDC589F}" vid="{4A3C46E8-61CC-4603-A589-7422A47A8E4A}"/>
     </a:ext>
   </a:extLst>
 </a:theme>
@@ -7796,7 +7807,7 @@
 </file>
 
 <file path=customXml/itemProps2.xml><?xml version="1.0" encoding="utf-8"?>
-<ds:datastoreItem xmlns:ds="http://schemas.openxmlformats.org/officeDocument/2006/customXml" ds:itemID="{D9CD8A3E-E2B6-47F8-B7D8-CDFFB4D236A7}">
+<ds:datastoreItem xmlns:ds="http://schemas.openxmlformats.org/officeDocument/2006/customXml" ds:itemID="{5026A035-D867-40B2-BE15-AF7DC389B6AF}">
   <ds:schemaRefs>
     <ds:schemaRef ds:uri="http://schemas.openxmlformats.org/officeDocument/2006/bibliography"/>
   </ds:schemaRefs>

</xml_diff>